<commit_message>
Projektinformation für das LISA, GitHub Pages
- 06_Projektinformation_LISA.md/.docx: Informationsschreiben an das LISA
  (Schulformen, Fächer, Termine, Organisationsform, Institution,
  Inhalte, Ansprechpartner)
- .nojekyll, damit GitHub Pages die Dateien unverändert ausliefert
- Kursprogramm verlinkt auf die neue Startseite statt auf das alte Repository

Co-Authored-By: Claude Opus 5.5 <noreply@anthropic.com>
</commit_message>
<xml_diff>
--- a/00_Kurskonzept/08_LISA_Anerkennung/01_Veranstalterangaben_und_Kursprogramm.docx
+++ b/00_Kurskonzept/08_LISA_Anerkennung/01_Veranstalterangaben_und_Kursprogramm.docx
@@ -1956,7 +1956,7 @@
         <w:spacing w:after="120"/>
       </w:pPr>
       <w:r>
-        <w:t xml:space="preserve">Präsentationen, Moderationsleitfäden, Arbeitshefte, Lösungshefte, Selbstlernmodule und Unterrichtsmaterial für die Sekundarstufe stehen unter der Lizenz CC BY 4.0 frei zur Verfügung: https://github.com/OVGU-VET-TechEd/mBot2_Fortbildung_Magdeburg</w:t>
+        <w:t xml:space="preserve">Präsentationen, Moderationsleitfäden, Arbeitshefte, Lösungshefte, Selbstlernmodule und Unterrichtsmaterial für die Sekundarstufe stehen unter der Lizenz CC BY 4.0 frei zur Verfügung: https://ovgu-vet-teched.github.io/MBOT2_Weiterbildung/ (Quellen: https://github.com/OVGU-VET-TechEd/MBOT2_Weiterbildung)</w:t>
       </w:r>
     </w:p>
     <w:p>
@@ -2277,6 +2277,21 @@
   <w:style w:type="paragraph" w:styleId="Normal" w:default="1">
     <w:name w:val="Normal"/>
     <w:qFormat/>
+  </w:style>
+  <w:style w:type="table" w:styleId="TableNormal" w:default="true">
+    <w:name w:val="Normal Table"/>
+    <w:uiPriority w:val="99"/>
+    <w:semiHidden/>
+    <w:unhideWhenUsed/>
+    <w:tblPr>
+      <w:tblInd w:type="dxa" w:w="0"/>
+      <w:tblCellMar>
+        <w:top w:type="dxa" w:w="0"/>
+        <w:left w:type="dxa" w:w="108"/>
+        <w:bottom w:type="dxa" w:w="0"/>
+        <w:right w:type="dxa" w:w="108"/>
+      </w:tblCellMar>
+    </w:tblPr>
   </w:style>
   <w:style w:type="paragraph" w:styleId="Title">
     <w:name w:val="Title"/>

</xml_diff>